<commit_message>
Force Arial on headings; add executive brief PDF
- Headings were rendering serif (LibreOffice heading styles); pin Arial
  across all elements so documents are fully house-style.
- Add a fixed-layout PDF of the executive brief (fonts embedded) as the
  send-ready version; MoU stays .docx for editing/signing.

Co-Authored-By: Claude Opus 4.8 (1M context) <noreply@anthropic.com>
</commit_message>
<xml_diff>
--- a/outreach/Executive-Brief-Digital-Sickle-Cell.docx
+++ b/outreach/Executive-Brief-Digital-Sickle-Cell.docx
@@ -3467,6 +3467,7 @@
       <w:spacing w:before="240" w:after="160"/>
     </w:pPr>
     <w:rPr>
+      <w:rFonts w:ascii="Arial;Helvetica;sans-serif" w:hAnsi="Arial;Helvetica;sans-serif" w:eastAsia="Arial;Helvetica;sans-serif" w:cs="Arial;Helvetica;sans-serif"/>
       <w:b/>
       <w:bCs/>
       <w:color w:val="000000"/>
@@ -3485,7 +3486,7 @@
       <w:outlineLvl w:val="1"/>
     </w:pPr>
     <w:rPr>
-      <w:rFonts w:ascii="Liberation Serif" w:hAnsi="Liberation Serif" w:eastAsia="Noto Serif CJK SC" w:cs="Noto Sans Devanagari"/>
+      <w:rFonts w:ascii="Arial;Helvetica;sans-serif" w:hAnsi="Arial;Helvetica;sans-serif" w:eastAsia="Arial;Helvetica;sans-serif" w:cs="Arial;Helvetica;sans-serif"/>
       <w:b/>
       <w:bCs/>
       <w:color w:val="000000"/>
@@ -3504,7 +3505,7 @@
       <w:outlineLvl w:val="2"/>
     </w:pPr>
     <w:rPr>
-      <w:rFonts w:ascii="Liberation Serif" w:hAnsi="Liberation Serif" w:eastAsia="Noto Serif CJK SC" w:cs="Noto Sans Devanagari"/>
+      <w:rFonts w:ascii="Arial;Helvetica;sans-serif" w:hAnsi="Arial;Helvetica;sans-serif" w:eastAsia="Arial;Helvetica;sans-serif" w:cs="Arial;Helvetica;sans-serif"/>
       <w:b/>
       <w:bCs/>
       <w:color w:val="000000"/>
@@ -3523,7 +3524,7 @@
       <w:outlineLvl w:val="3"/>
     </w:pPr>
     <w:rPr>
-      <w:rFonts w:ascii="Liberation Serif" w:hAnsi="Liberation Serif" w:eastAsia="Noto Serif CJK SC" w:cs="Noto Sans Devanagari"/>
+      <w:rFonts w:ascii="Arial;Helvetica;sans-serif" w:hAnsi="Arial;Helvetica;sans-serif" w:eastAsia="Arial;Helvetica;sans-serif" w:cs="Arial;Helvetica;sans-serif"/>
       <w:b/>
       <w:bCs/>
       <w:color w:val="000000"/>
@@ -3621,6 +3622,7 @@
       <w:jc w:val="left"/>
     </w:pPr>
     <w:rPr>
+      <w:rFonts w:ascii="Arial;Helvetica;sans-serif" w:hAnsi="Arial;Helvetica;sans-serif" w:eastAsia="Arial;Helvetica;sans-serif" w:cs="Arial;Helvetica;sans-serif"/>
       <w:sz w:val="21"/>
       <w:szCs w:val="21"/>
     </w:rPr>
@@ -3666,7 +3668,9 @@
     <w:pPr>
       <w:spacing w:before="0" w:after="160"/>
     </w:pPr>
-    <w:rPr/>
+    <w:rPr>
+      <w:rFonts w:ascii="Arial;Helvetica;sans-serif" w:hAnsi="Arial;Helvetica;sans-serif" w:eastAsia="Arial;Helvetica;sans-serif" w:cs="Arial;Helvetica;sans-serif"/>
+    </w:rPr>
   </w:style>
   <w:style w:type="paragraph" w:styleId="Heading">
     <w:name w:val="Heading"/>
@@ -3695,6 +3699,7 @@
       <w:ind w:hanging="0" w:left="160" w:right="160"/>
     </w:pPr>
     <w:rPr>
+      <w:rFonts w:ascii="Arial;Helvetica;sans-serif" w:hAnsi="Arial;Helvetica;sans-serif" w:eastAsia="Arial;Helvetica;sans-serif" w:cs="Arial;Helvetica;sans-serif"/>
       <w:color w:val="222222"/>
     </w:rPr>
   </w:style>
@@ -3708,6 +3713,7 @@
       <w:jc w:val="left"/>
     </w:pPr>
     <w:rPr>
+      <w:rFonts w:ascii="Arial;Helvetica;sans-serif" w:hAnsi="Arial;Helvetica;sans-serif" w:eastAsia="Arial;Helvetica;sans-serif" w:cs="Arial;Helvetica;sans-serif"/>
       <w:b/>
       <w:bCs/>
       <w:sz w:val="21"/>

</xml_diff>

<commit_message>
Scope generic documents to an initial phase ending 31 March 2027
Incorporates programme feedback: the MoU commits only to an initial phase
completing by 31 March 2027 with a stand-alone output (a report), with any
continuation beyond that subject to a further agreement and confirmed onward
funding. Brief ask/timeline reframed as a bounded, low-risk commitment.

Co-Authored-By: Claude Opus 4.8 (1M context) <noreply@anthropic.com>
</commit_message>
<xml_diff>
--- a/outreach/Executive-Brief-Digital-Sickle-Cell.docx
+++ b/outreach/Executive-Brief-Digital-Sickle-Cell.docx
@@ -698,7 +698,17 @@
       </w:pPr>
       <w:r>
         <w:rPr/>
-        <w:t>We are seeking a strategic partner that delivers sickle cell and acute care and can provide:</w:t>
+        <w:t xml:space="preserve">We are seeking a strategic partner that delivers sickle cell and acute care to join us in an </w:t>
+      </w:r>
+      <w:r>
+        <w:rPr>
+          <w:rStyle w:val="Strong"/>
+        </w:rPr>
+        <w:t>initial phase that completes by 31 March 2027</w:t>
+      </w:r>
+      <w:r>
+        <w:rPr/>
+        <w:t xml:space="preserve"> and delivers a stand-alone output. The partner would provide:</w:t>
       </w:r>
     </w:p>
     <w:p>
@@ -753,7 +763,7 @@
       </w:r>
       <w:r>
         <w:rPr/>
-        <w:t xml:space="preserve"> for a private beta, principally the engagement of clinical staff in </w:t>
+        <w:t xml:space="preserve"> for the initial private beta, principally the engagement of clinical staff in </w:t>
       </w:r>
       <w:r>
         <w:rPr>
@@ -791,11 +801,31 @@
         <w:rPr>
           <w:rStyle w:val="Strong"/>
         </w:rPr>
-        <w:t>Memorandum of Understanding</w:t>
-      </w:r>
-      <w:r>
-        <w:rPr/>
-        <w:t xml:space="preserve"> including a financial commitment, with payment falling due once we have awarded the delivery tender. The Observatory leads the programme, retains overall control, and conducts the procurement, commercial, technical and legal work.</w:t>
+        <w:t>Memorandum of Understanding for this initial phase</w:t>
+      </w:r>
+      <w:r>
+        <w:rPr/>
+        <w:t xml:space="preserve">. The Observatory leads the programme, retains overall control, and conducts the procurement, commercial, technical and legal work. This is a deliberately </w:t>
+      </w:r>
+      <w:r>
+        <w:rPr>
+          <w:rStyle w:val="Strong"/>
+        </w:rPr>
+        <w:t>bounded, time-defined and low-risk</w:t>
+      </w:r>
+      <w:r>
+        <w:rPr/>
+        <w:t xml:space="preserve"> commitment: it delivers a usable service and a </w:t>
+      </w:r>
+      <w:r>
+        <w:rPr>
+          <w:rStyle w:val="Strong"/>
+        </w:rPr>
+        <w:t>stand-alone report</w:t>
+      </w:r>
+      <w:r>
+        <w:rPr/>
+        <w:t xml:space="preserve"> by 31 March 2027, so the work has lasting value whether or not it continues. Any continuation beyond that date would be subject to a further agreement and confirmed onward funding.</w:t>
       </w:r>
     </w:p>
     <w:p>
@@ -808,11 +838,33 @@
       <w:r>
         <w:rPr/>
         <w:t>Timeline</w:t>
+      </w:r>
+    </w:p>
+    <w:p>
+      <w:pPr>
+        <w:pStyle w:val="BodyText"/>
+        <w:bidi w:val="0"/>
+        <w:jc w:val="left"/>
+        <w:rPr/>
+      </w:pPr>
+      <w:r>
+        <w:rPr/>
+        <w:t xml:space="preserve">We propose a defined initial phase that completes by </w:t>
+      </w:r>
+      <w:r>
+        <w:rPr>
+          <w:rStyle w:val="Strong"/>
+        </w:rPr>
+        <w:t>31 March 2027</w:t>
+      </w:r>
+      <w:r>
+        <w:rPr/>
+        <w:t xml:space="preserve"> and produces a stand-alone output. Work beyond that date is subject to confirmed onward funding.</w:t>
       </w:r>
     </w:p>
     <w:tbl>
       <w:tblPr>
-        <w:tblW w:w="9906" w:type="dxa"/>
+        <w:tblW w:w="5000" w:type="pct"/>
         <w:jc w:val="left"/>
         <w:tblInd w:w="28" w:type="dxa"/>
         <w:tblLayout w:type="fixed"/>
@@ -824,9 +876,9 @@
         </w:tblCellMar>
       </w:tblPr>
       <w:tblGrid>
-        <w:gridCol w:w="2454"/>
-        <w:gridCol w:w="2159"/>
-        <w:gridCol w:w="5293"/>
+        <w:gridCol w:w="2150"/>
+        <w:gridCol w:w="2863"/>
+        <w:gridCol w:w="6326"/>
       </w:tblGrid>
       <w:tr>
         <w:trPr>
@@ -834,7 +886,7 @@
         </w:trPr>
         <w:tc>
           <w:tcPr>
-            <w:tcW w:w="2454" w:type="dxa"/>
+            <w:tcW w:w="2150" w:type="dxa"/>
             <w:tcBorders/>
             <w:vAlign w:val="center"/>
           </w:tcPr>
@@ -856,7 +908,7 @@
         </w:tc>
         <w:tc>
           <w:tcPr>
-            <w:tcW w:w="2159" w:type="dxa"/>
+            <w:tcW w:w="2863" w:type="dxa"/>
             <w:tcBorders/>
             <w:vAlign w:val="center"/>
           </w:tcPr>
@@ -878,7 +930,7 @@
         </w:tc>
         <w:tc>
           <w:tcPr>
-            <w:tcW w:w="5293" w:type="dxa"/>
+            <w:tcW w:w="6326" w:type="dxa"/>
             <w:tcBorders/>
             <w:vAlign w:val="center"/>
           </w:tcPr>
@@ -903,7 +955,7 @@
         <w:trPr/>
         <w:tc>
           <w:tcPr>
-            <w:tcW w:w="2454" w:type="dxa"/>
+            <w:tcW w:w="2150" w:type="dxa"/>
             <w:tcBorders/>
             <w:vAlign w:val="center"/>
           </w:tcPr>
@@ -917,13 +969,13 @@
             </w:pPr>
             <w:r>
               <w:rPr/>
-              <w:t>Partnership development</w:t>
+              <w:t>Partnership and discovery</w:t>
             </w:r>
           </w:p>
         </w:tc>
         <w:tc>
           <w:tcPr>
-            <w:tcW w:w="2159" w:type="dxa"/>
+            <w:tcW w:w="2863" w:type="dxa"/>
             <w:tcBorders/>
             <w:vAlign w:val="center"/>
           </w:tcPr>
@@ -937,13 +989,13 @@
             </w:pPr>
             <w:r>
               <w:rPr/>
-              <w:t>Jun – Sept 2026</w:t>
+              <w:t>2026</w:t>
             </w:r>
           </w:p>
         </w:tc>
         <w:tc>
           <w:tcPr>
-            <w:tcW w:w="5293" w:type="dxa"/>
+            <w:tcW w:w="6326" w:type="dxa"/>
             <w:tcBorders/>
             <w:vAlign w:val="center"/>
           </w:tcPr>
@@ -957,7 +1009,7 @@
             </w:pPr>
             <w:r>
               <w:rPr/>
-              <w:t>MoU, appoint delivery partner</w:t>
+              <w:t>Agree partnership, set-up, user research and design</w:t>
             </w:r>
           </w:p>
         </w:tc>
@@ -966,7 +1018,7 @@
         <w:trPr/>
         <w:tc>
           <w:tcPr>
-            <w:tcW w:w="2454" w:type="dxa"/>
+            <w:tcW w:w="2150" w:type="dxa"/>
             <w:tcBorders/>
             <w:vAlign w:val="center"/>
           </w:tcPr>
@@ -980,13 +1032,13 @@
             </w:pPr>
             <w:r>
               <w:rPr/>
-              <w:t>Digital service build</w:t>
+              <w:t>Build and initial beta</w:t>
             </w:r>
           </w:p>
         </w:tc>
         <w:tc>
           <w:tcPr>
-            <w:tcW w:w="2159" w:type="dxa"/>
+            <w:tcW w:w="2863" w:type="dxa"/>
             <w:tcBorders/>
             <w:vAlign w:val="center"/>
           </w:tcPr>
@@ -1000,13 +1052,13 @@
             </w:pPr>
             <w:r>
               <w:rPr/>
-              <w:t>Oct 2026 – May 2027</w:t>
+              <w:t>to 31 March 2027</w:t>
             </w:r>
           </w:p>
         </w:tc>
         <w:tc>
           <w:tcPr>
-            <w:tcW w:w="5293" w:type="dxa"/>
+            <w:tcW w:w="6326" w:type="dxa"/>
             <w:tcBorders/>
             <w:vAlign w:val="center"/>
           </w:tcPr>
@@ -1020,7 +1072,7 @@
             </w:pPr>
             <w:r>
               <w:rPr/>
-              <w:t>Discovery, alpha, private-beta build</w:t>
+              <w:t>Build the service, begin a private beta, deliver a stand-alone report on the work and learning</w:t>
             </w:r>
           </w:p>
         </w:tc>
@@ -1029,7 +1081,7 @@
         <w:trPr/>
         <w:tc>
           <w:tcPr>
-            <w:tcW w:w="2454" w:type="dxa"/>
+            <w:tcW w:w="2150" w:type="dxa"/>
             <w:tcBorders/>
             <w:vAlign w:val="center"/>
           </w:tcPr>
@@ -1043,13 +1095,13 @@
             </w:pPr>
             <w:r>
               <w:rPr/>
-              <w:t>Pilot and iteration</w:t>
+              <w:t>Continuation</w:t>
             </w:r>
           </w:p>
         </w:tc>
         <w:tc>
           <w:tcPr>
-            <w:tcW w:w="2159" w:type="dxa"/>
+            <w:tcW w:w="2863" w:type="dxa"/>
             <w:tcBorders/>
             <w:vAlign w:val="center"/>
           </w:tcPr>
@@ -1063,13 +1115,13 @@
             </w:pPr>
             <w:r>
               <w:rPr/>
-              <w:t>Jun 2027 – Sept 2028</w:t>
+              <w:t>beyond March 2027 (subject to funding)</w:t>
             </w:r>
           </w:p>
         </w:tc>
         <w:tc>
           <w:tcPr>
-            <w:tcW w:w="5293" w:type="dxa"/>
+            <w:tcW w:w="6326" w:type="dxa"/>
             <w:tcBorders/>
             <w:vAlign w:val="center"/>
           </w:tcPr>
@@ -1083,7 +1135,7 @@
             </w:pPr>
             <w:r>
               <w:rPr/>
-              <w:t>Private beta with selected patients; evaluate and iterate</w:t>
+              <w:t>Wider pilot, iteration and national spread</w:t>
             </w:r>
           </w:p>
         </w:tc>

</xml_diff>

<commit_message>
Deliverable = workable digital service; add Vertex funding disclosure
- Initial-phase deliverable reframed from a report to a stand-alone,
  workable digital service across the brief and MoU.
- Add Vertex Pharmaceuticals funding disclosure (Phase 1) to the website
  (footer + governance page) and the executive brief, per the grant
  agreement's acknowledgement requirement. Name only, no product reference,
  independence stated.
- Git-ignore the confidential signed funder contract.

Co-Authored-By: Claude Opus 4.8 (1M context) <noreply@anthropic.com>
</commit_message>
<xml_diff>
--- a/outreach/Executive-Brief-Digital-Sickle-Cell.docx
+++ b/outreach/Executive-Brief-Digital-Sickle-Cell.docx
@@ -815,13 +815,13 @@
       </w:r>
       <w:r>
         <w:rPr/>
-        <w:t xml:space="preserve"> commitment: it delivers a usable service and a </w:t>
-      </w:r>
-      <w:r>
-        <w:rPr>
-          <w:rStyle w:val="Strong"/>
-        </w:rPr>
-        <w:t>stand-alone report</w:t>
+        <w:t xml:space="preserve"> commitment: it delivers a </w:t>
+      </w:r>
+      <w:r>
+        <w:rPr>
+          <w:rStyle w:val="Strong"/>
+        </w:rPr>
+        <w:t>stand-alone, workable digital service</w:t>
       </w:r>
       <w:r>
         <w:rPr/>
@@ -859,7 +859,7 @@
       </w:r>
       <w:r>
         <w:rPr/>
-        <w:t xml:space="preserve"> and produces a stand-alone output. Work beyond that date is subject to confirmed onward funding.</w:t>
+        <w:t xml:space="preserve"> and delivers a working digital service. Work beyond that date is subject to confirmed onward funding.</w:t>
       </w:r>
     </w:p>
     <w:tbl>
@@ -876,9 +876,9 @@
         </w:tblCellMar>
       </w:tblPr>
       <w:tblGrid>
-        <w:gridCol w:w="2150"/>
-        <w:gridCol w:w="2863"/>
-        <w:gridCol w:w="6326"/>
+        <w:gridCol w:w="2169"/>
+        <w:gridCol w:w="2909"/>
+        <w:gridCol w:w="6261"/>
       </w:tblGrid>
       <w:tr>
         <w:trPr>
@@ -886,7 +886,7 @@
         </w:trPr>
         <w:tc>
           <w:tcPr>
-            <w:tcW w:w="2150" w:type="dxa"/>
+            <w:tcW w:w="2169" w:type="dxa"/>
             <w:tcBorders/>
             <w:vAlign w:val="center"/>
           </w:tcPr>
@@ -908,7 +908,7 @@
         </w:tc>
         <w:tc>
           <w:tcPr>
-            <w:tcW w:w="2863" w:type="dxa"/>
+            <w:tcW w:w="2909" w:type="dxa"/>
             <w:tcBorders/>
             <w:vAlign w:val="center"/>
           </w:tcPr>
@@ -930,7 +930,7 @@
         </w:tc>
         <w:tc>
           <w:tcPr>
-            <w:tcW w:w="6326" w:type="dxa"/>
+            <w:tcW w:w="6261" w:type="dxa"/>
             <w:tcBorders/>
             <w:vAlign w:val="center"/>
           </w:tcPr>
@@ -955,7 +955,7 @@
         <w:trPr/>
         <w:tc>
           <w:tcPr>
-            <w:tcW w:w="2150" w:type="dxa"/>
+            <w:tcW w:w="2169" w:type="dxa"/>
             <w:tcBorders/>
             <w:vAlign w:val="center"/>
           </w:tcPr>
@@ -975,7 +975,7 @@
         </w:tc>
         <w:tc>
           <w:tcPr>
-            <w:tcW w:w="2863" w:type="dxa"/>
+            <w:tcW w:w="2909" w:type="dxa"/>
             <w:tcBorders/>
             <w:vAlign w:val="center"/>
           </w:tcPr>
@@ -995,7 +995,7 @@
         </w:tc>
         <w:tc>
           <w:tcPr>
-            <w:tcW w:w="6326" w:type="dxa"/>
+            <w:tcW w:w="6261" w:type="dxa"/>
             <w:tcBorders/>
             <w:vAlign w:val="center"/>
           </w:tcPr>
@@ -1018,7 +1018,7 @@
         <w:trPr/>
         <w:tc>
           <w:tcPr>
-            <w:tcW w:w="2150" w:type="dxa"/>
+            <w:tcW w:w="2169" w:type="dxa"/>
             <w:tcBorders/>
             <w:vAlign w:val="center"/>
           </w:tcPr>
@@ -1038,7 +1038,7 @@
         </w:tc>
         <w:tc>
           <w:tcPr>
-            <w:tcW w:w="2863" w:type="dxa"/>
+            <w:tcW w:w="2909" w:type="dxa"/>
             <w:tcBorders/>
             <w:vAlign w:val="center"/>
           </w:tcPr>
@@ -1058,7 +1058,7 @@
         </w:tc>
         <w:tc>
           <w:tcPr>
-            <w:tcW w:w="6326" w:type="dxa"/>
+            <w:tcW w:w="6261" w:type="dxa"/>
             <w:tcBorders/>
             <w:vAlign w:val="center"/>
           </w:tcPr>
@@ -1072,7 +1072,7 @@
             </w:pPr>
             <w:r>
               <w:rPr/>
-              <w:t>Build the service, begin a private beta, deliver a stand-alone report on the work and learning</w:t>
+              <w:t>Build and deploy a working digital service, and begin a private beta with selected patients</w:t>
             </w:r>
           </w:p>
         </w:tc>
@@ -1081,7 +1081,7 @@
         <w:trPr/>
         <w:tc>
           <w:tcPr>
-            <w:tcW w:w="2150" w:type="dxa"/>
+            <w:tcW w:w="2169" w:type="dxa"/>
             <w:tcBorders/>
             <w:vAlign w:val="center"/>
           </w:tcPr>
@@ -1101,7 +1101,7 @@
         </w:tc>
         <w:tc>
           <w:tcPr>
-            <w:tcW w:w="2863" w:type="dxa"/>
+            <w:tcW w:w="2909" w:type="dxa"/>
             <w:tcBorders/>
             <w:vAlign w:val="center"/>
           </w:tcPr>
@@ -1121,7 +1121,7 @@
         </w:tc>
         <w:tc>
           <w:tcPr>
-            <w:tcW w:w="6326" w:type="dxa"/>
+            <w:tcW w:w="6261" w:type="dxa"/>
             <w:tcBorders/>
             <w:vAlign w:val="center"/>
           </w:tcPr>
@@ -1364,6 +1364,30 @@
       <w:r>
         <w:rPr/>
         <w:t>, Chief Executive, NHS Race &amp; Health Observatory</w:t>
+      </w:r>
+    </w:p>
+    <w:p>
+      <w:pPr>
+        <w:pStyle w:val="Heading2"/>
+        <w:bidi w:val="0"/>
+        <w:jc w:val="left"/>
+        <w:rPr/>
+      </w:pPr>
+      <w:r>
+        <w:rPr/>
+        <w:t>Funding</w:t>
+      </w:r>
+    </w:p>
+    <w:p>
+      <w:pPr>
+        <w:pStyle w:val="BodyText"/>
+        <w:bidi w:val="0"/>
+        <w:jc w:val="left"/>
+        <w:rPr/>
+      </w:pPr>
+      <w:r>
+        <w:rPr/>
+        <w:t>Phase 1 of this programme was supported by a grant from Vertex Pharmaceuticals. Vertex had no role in the design, content or delivery of the programme.</w:t>
       </w:r>
     </w:p>
     <w:p>

</xml_diff>